<commit_message>
court(wisctapp): amicus-brief date and signature one block, counsel spacing above each group (fb-595.54.46)
Co-Authored-By: Claude Opus 5.5 <noreply@anthropic.com>
</commit_message>
<xml_diff>
--- a/courts/seventh-circuit/wisconsin/state/court-of-appeals/amicus-brief/usage/OUTPUT-amicus-brief.docx
+++ b/courts/seventh-circuit/wisconsin/state/court-of-appeals/amicus-brief/usage/OUTPUT-amicus-brief.docx
@@ -6085,28 +6085,6 @@
     </w:p>
     <w:p>
       <w:pPr>
-        <w:spacing w:before="432" w:after="0" w:line="299" w:lineRule="exact"/>
-        <w:ind w:left="0" w:firstLine="0"/>
-        <w:jc w:val="left"/>
-      </w:pPr>
-      <w:r>
-        <w:t xml:space="preserve">October</w:t>
-      </w:r>
-      <w:r>
-        <w:t xml:space="preserve"> </w:t>
-      </w:r>
-      <w:r>
-        <w:t xml:space="preserve">15,</w:t>
-      </w:r>
-      <w:r>
-        <w:t xml:space="preserve"> </w:t>
-      </w:r>
-      <w:r>
-        <w:t xml:space="preserve">2020</w:t>
-      </w:r>
-    </w:p>
-    <w:p>
-      <w:pPr>
         <w:spacing w:before="0" w:after="0" w:line="432" w:lineRule="exact"/>
       </w:pPr>
     </w:p>
@@ -6133,6 +6111,33 @@
           <w:tcPr>
             <w:tcW w:w="8640" w:type="dxa"/>
           </w:tcPr>
+          <w:p>
+            <w:pPr>
+              <w:spacing w:before="0" w:after="0" w:line="299" w:lineRule="exact"/>
+              <w:ind w:left="0" w:firstLine="0"/>
+              <w:jc w:val="left"/>
+            </w:pPr>
+            <w:r>
+              <w:t xml:space="preserve">October</w:t>
+            </w:r>
+            <w:r>
+              <w:t xml:space="preserve"> </w:t>
+            </w:r>
+            <w:r>
+              <w:t xml:space="preserve">15,</w:t>
+            </w:r>
+            <w:r>
+              <w:t xml:space="preserve"> </w:t>
+            </w:r>
+            <w:r>
+              <w:t xml:space="preserve">2020</w:t>
+            </w:r>
+          </w:p>
+          <w:p>
+            <w:pPr>
+              <w:spacing w:before="0" w:after="0" w:line="104" w:lineRule="exact"/>
+            </w:pPr>
+          </w:p>
           <w:tbl>
             <w:tblPr>
               <w:tblW w:w="8640" w:type="dxa"/>
@@ -6762,6 +6767,11 @@
           <w:tcPr>
             <w:tcW w:w="8640" w:type="dxa"/>
           </w:tcPr>
+          <w:p>
+            <w:pPr>
+              <w:spacing w:before="0" w:after="0" w:line="104" w:lineRule="exact"/>
+            </w:pPr>
+          </w:p>
           <w:tbl>
             <w:tblPr>
               <w:tblW w:w="8640" w:type="dxa"/>
@@ -7601,6 +7611,11 @@
           <w:tcPr>
             <w:tcW w:w="8640" w:type="dxa"/>
           </w:tcPr>
+          <w:p>
+            <w:pPr>
+              <w:spacing w:before="0" w:after="0" w:line="104" w:lineRule="exact"/>
+            </w:pPr>
+          </w:p>
           <w:tbl>
             <w:tblPr>
               <w:tblW w:w="8640" w:type="dxa"/>

</xml_diff>